<commit_message>
Deploy preview for PR 40 🛫
</commit_message>
<xml_diff>
--- a/pr-preview/pr-40/Your-Book-Title-tracked-changes.docx
+++ b/pr-preview/pr-40/Your-Book-Title-tracked-changes.docx
@@ -2276,7 +2276,7 @@
       </w:ins>
       <w:ins w:id="80" w:author="PR Preview" w:date="2024-01-01T00:00:00Z">
         <w:r>
-          <w:t xml:space="preserve">ac85cd5</w:t>
+          <w:t xml:space="preserve">ff709bf</w:t>
         </w:r>
       </w:ins>
     </w:p>
@@ -2304,7 +2304,7 @@
       </w:ins>
       <w:ins w:id="81" w:author="PR Preview" w:date="2024-01-01T00:00:00Z">
         <w:r>
-          <w:t xml:space="preserve">ac85cd530d923c7ddb4fa224d8c0c7a3e56fe4c0</w:t>
+          <w:t xml:space="preserve">ff709bf950c7055c3e2ae74de97bef15febe2b70</w:t>
         </w:r>
       </w:ins>
     </w:p>
@@ -2332,7 +2332,7 @@
       </w:ins>
       <w:ins w:id="82" w:author="PR Preview" w:date="2024-01-01T00:00:00Z">
         <w:r>
-          <w:t xml:space="preserve">2026-05-18 20:31:54 -0700</w:t>
+          <w:t xml:space="preserve">2026-05-19 07:56:21 +0000</w:t>
         </w:r>
       </w:ins>
     </w:p>

</xml_diff>